<commit_message>
Update week 1 homework
</commit_message>
<xml_diff>
--- a/docs/notes/W01_我的作业.docx
+++ b/docs/notes/W01_我的作业.docx
@@ -117,21 +117,7 @@
         <w:rPr>
           <w:lang w:eastAsia="zh-CN"/>
         </w:rPr>
-        <w:t xml:space="preserve"> </w:t>
-      </w:r>
-      <w:proofErr w:type="spellStart"/>
-      <w:r>
-        <w:rPr>
-          <w:lang w:eastAsia="zh-CN"/>
-        </w:rPr>
-        <w:t>environment.yml</w:t>
-      </w:r>
-      <w:proofErr w:type="spellEnd"/>
-      <w:r>
-        <w:rPr>
-          <w:lang w:eastAsia="zh-CN"/>
-        </w:rPr>
-        <w:t xml:space="preserve"> </w:t>
+        <w:t xml:space="preserve"> environment.yml </w:t>
       </w:r>
       <w:r>
         <w:rPr>
@@ -192,26 +178,16 @@
       <w:pPr>
         <w:pStyle w:val="21"/>
       </w:pPr>
-      <w:proofErr w:type="spellStart"/>
       <w:r>
         <w:t>基本信息</w:t>
       </w:r>
-      <w:proofErr w:type="spellEnd"/>
     </w:p>
     <w:p>
-      <w:proofErr w:type="spellStart"/>
       <w:r>
         <w:rPr>
           <w:b/>
         </w:rPr>
-        <w:t>姓名与日期</w:t>
-      </w:r>
-      <w:proofErr w:type="spellEnd"/>
-      <w:r>
-        <w:rPr>
-          <w:b/>
-        </w:rPr>
-        <w:t>：</w:t>
+        <w:t>姓名与日期：</w:t>
       </w:r>
       <w:r>
         <w:rPr>
@@ -225,25 +201,23 @@
           <w:color w:val="646464"/>
           <w:lang w:eastAsia="zh-CN"/>
         </w:rPr>
-        <w:t>代若</w:t>
-      </w:r>
-      <w:proofErr w:type="gramStart"/>
+        <w:t>代若萱</w:t>
+      </w:r>
       <w:r>
         <w:rPr>
           <w:rFonts w:hint="eastAsia"/>
           <w:color w:val="646464"/>
           <w:lang w:eastAsia="zh-CN"/>
         </w:rPr>
-        <w:t>萱</w:t>
-      </w:r>
-      <w:proofErr w:type="gramEnd"/>
+        <w:t xml:space="preserve"> 10.2</w:t>
+      </w:r>
       <w:r>
         <w:rPr>
           <w:rFonts w:hint="eastAsia"/>
           <w:color w:val="646464"/>
           <w:lang w:eastAsia="zh-CN"/>
         </w:rPr>
-        <w:t xml:space="preserve"> 10.27</w:t>
+        <w:t>8</w:t>
       </w:r>
       <w:r>
         <w:rPr>
@@ -863,10 +837,11 @@
       </w:r>
       <w:r>
         <w:rPr>
-          <w:color w:val="646464"/>
-          <w:lang w:eastAsia="zh-CN"/>
-        </w:rPr>
-        <w:t>填写</w:t>
+          <w:rFonts w:hint="eastAsia"/>
+          <w:color w:val="646464"/>
+          <w:lang w:eastAsia="zh-CN"/>
+        </w:rPr>
+        <w:t>完成第一周作业</w:t>
       </w:r>
       <w:r>
         <w:rPr>
@@ -879,14 +854,15 @@
     <w:p>
       <w:pPr>
         <w:rPr>
-          <w:lang w:eastAsia="zh-CN"/>
-        </w:rPr>
-      </w:pPr>
-      <w:r>
-        <w:rPr>
           <w:b/>
           <w:lang w:eastAsia="zh-CN"/>
         </w:rPr>
+      </w:pPr>
+      <w:r>
+        <w:rPr>
+          <w:b/>
+          <w:lang w:eastAsia="zh-CN"/>
+        </w:rPr>
         <w:t>当前系统环境（</w:t>
       </w:r>
       <w:r>
@@ -930,42 +906,15 @@
           <w:lang w:eastAsia="zh-CN"/>
         </w:rPr>
         <w:t>等）：</w:t>
-      </w:r>
-      <w:r>
-        <w:rPr>
-          <w:color w:val="646464"/>
-          <w:lang w:eastAsia="zh-CN"/>
-        </w:rPr>
-        <w:t>[</w:t>
-      </w:r>
-      <w:r>
-        <w:rPr>
-          <w:color w:val="646464"/>
-          <w:lang w:eastAsia="zh-CN"/>
-        </w:rPr>
-        <w:t>填写</w:t>
-      </w:r>
-      <w:r>
-        <w:rPr>
-          <w:color w:val="646464"/>
-          <w:lang w:eastAsia="zh-CN"/>
-        </w:rPr>
-        <w:t>]</w:t>
       </w:r>
     </w:p>
     <w:p>
       <w:pPr>
         <w:rPr>
-          <w:lang w:eastAsia="zh-CN"/>
-        </w:rPr>
-      </w:pPr>
-      <w:r>
-        <w:rPr>
-          <w:b/>
-          <w:lang w:eastAsia="zh-CN"/>
-        </w:rPr>
-        <w:t>项目真实路径：</w:t>
-      </w:r>
+          <w:color w:val="646464"/>
+          <w:lang w:eastAsia="zh-CN"/>
+        </w:rPr>
+      </w:pPr>
       <w:r>
         <w:rPr>
           <w:color w:val="646464"/>
@@ -978,185 +927,1059 @@
           <w:color w:val="646464"/>
           <w:lang w:eastAsia="zh-CN"/>
         </w:rPr>
-        <w:t>填写</w:t>
-      </w:r>
-      <w:r>
-        <w:rPr>
-          <w:color w:val="646464"/>
-          <w:lang w:eastAsia="zh-CN"/>
-        </w:rPr>
-        <w:t>]</w:t>
+        <w:t>操作系统：</w:t>
+      </w:r>
+      <w:r>
+        <w:rPr>
+          <w:color w:val="646464"/>
+          <w:lang w:eastAsia="zh-CN"/>
+        </w:rPr>
+        <w:t xml:space="preserve">Windows 11 </w:t>
+      </w:r>
+      <w:r>
+        <w:rPr>
+          <w:color w:val="646464"/>
+          <w:lang w:eastAsia="zh-CN"/>
+        </w:rPr>
+        <w:t>家庭中文版</w:t>
+      </w:r>
+      <w:r>
+        <w:rPr>
+          <w:color w:val="646464"/>
+          <w:lang w:eastAsia="zh-CN"/>
+        </w:rPr>
+        <w:t xml:space="preserve"> 25H2</w:t>
+      </w:r>
+      <w:r>
+        <w:rPr>
+          <w:color w:val="646464"/>
+          <w:lang w:eastAsia="zh-CN"/>
+        </w:rPr>
+        <w:t>，</w:t>
+      </w:r>
+      <w:r>
+        <w:rPr>
+          <w:color w:val="646464"/>
+          <w:lang w:eastAsia="zh-CN"/>
+        </w:rPr>
+        <w:t xml:space="preserve">64 </w:t>
+      </w:r>
+      <w:r>
+        <w:rPr>
+          <w:color w:val="646464"/>
+          <w:lang w:eastAsia="zh-CN"/>
+        </w:rPr>
+        <w:t>位</w:t>
+      </w:r>
+      <w:r>
+        <w:rPr>
+          <w:color w:val="646464"/>
+          <w:lang w:eastAsia="zh-CN"/>
+        </w:rPr>
+        <w:t xml:space="preserve"> x64</w:t>
       </w:r>
     </w:p>
     <w:p>
       <w:pPr>
         <w:rPr>
-          <w:lang w:eastAsia="zh-CN"/>
-        </w:rPr>
-      </w:pPr>
-      <w:r>
-        <w:rPr>
-          <w:b/>
-          <w:lang w:eastAsia="zh-CN"/>
-        </w:rPr>
-        <w:t>相关文件：</w:t>
-      </w:r>
-      <w:r>
-        <w:rPr>
-          <w:color w:val="646464"/>
-          <w:lang w:eastAsia="zh-CN"/>
-        </w:rPr>
-        <w:t>[</w:t>
-      </w:r>
-      <w:r>
-        <w:rPr>
-          <w:color w:val="646464"/>
-          <w:lang w:eastAsia="zh-CN"/>
-        </w:rPr>
-        <w:t>填写</w:t>
-      </w:r>
-      <w:r>
-        <w:rPr>
-          <w:color w:val="646464"/>
-          <w:lang w:eastAsia="zh-CN"/>
-        </w:rPr>
-        <w:t>]</w:t>
+          <w:color w:val="646464"/>
+          <w:lang w:eastAsia="zh-CN"/>
+        </w:rPr>
+      </w:pPr>
+      <w:r>
+        <w:rPr>
+          <w:color w:val="646464"/>
+          <w:lang w:eastAsia="zh-CN"/>
+        </w:rPr>
+        <w:t xml:space="preserve">VS Code </w:t>
+      </w:r>
+      <w:r>
+        <w:rPr>
+          <w:color w:val="646464"/>
+          <w:lang w:eastAsia="zh-CN"/>
+        </w:rPr>
+        <w:t>终端</w:t>
+      </w:r>
+      <w:r>
+        <w:rPr>
+          <w:color w:val="646464"/>
+          <w:lang w:eastAsia="zh-CN"/>
+        </w:rPr>
+        <w:t xml:space="preserve"> Shell</w:t>
+      </w:r>
+      <w:r>
+        <w:rPr>
+          <w:color w:val="646464"/>
+          <w:lang w:eastAsia="zh-CN"/>
+        </w:rPr>
+        <w:t>：</w:t>
+      </w:r>
+      <w:r>
+        <w:rPr>
+          <w:color w:val="646464"/>
+          <w:lang w:eastAsia="zh-CN"/>
+        </w:rPr>
+        <w:t>PowerShell</w:t>
       </w:r>
     </w:p>
     <w:p>
       <w:pPr>
         <w:rPr>
-          <w:lang w:eastAsia="zh-CN"/>
-        </w:rPr>
-      </w:pPr>
-      <w:r>
-        <w:rPr>
-          <w:b/>
-          <w:lang w:eastAsia="zh-CN"/>
-        </w:rPr>
-        <w:t>已验证结果：</w:t>
-      </w:r>
-      <w:r>
-        <w:rPr>
-          <w:color w:val="646464"/>
-          <w:lang w:eastAsia="zh-CN"/>
-        </w:rPr>
-        <w:t>[</w:t>
-      </w:r>
-      <w:r>
-        <w:rPr>
-          <w:color w:val="646464"/>
-          <w:lang w:eastAsia="zh-CN"/>
-        </w:rPr>
-        <w:t>填写</w:t>
-      </w:r>
-      <w:r>
-        <w:rPr>
-          <w:color w:val="646464"/>
-          <w:lang w:eastAsia="zh-CN"/>
-        </w:rPr>
-        <w:t>]</w:t>
+          <w:color w:val="646464"/>
+          <w:lang w:eastAsia="zh-CN"/>
+        </w:rPr>
+      </w:pPr>
+      <w:r>
+        <w:rPr>
+          <w:color w:val="646464"/>
+          <w:lang w:eastAsia="zh-CN"/>
+        </w:rPr>
+        <w:t xml:space="preserve">Conda </w:t>
+      </w:r>
+      <w:r>
+        <w:rPr>
+          <w:color w:val="646464"/>
+          <w:lang w:eastAsia="zh-CN"/>
+        </w:rPr>
+        <w:t>发行版：</w:t>
+      </w:r>
+      <w:r>
+        <w:rPr>
+          <w:color w:val="646464"/>
+          <w:lang w:eastAsia="zh-CN"/>
+        </w:rPr>
+        <w:t>Anaconda</w:t>
       </w:r>
     </w:p>
     <w:p>
       <w:pPr>
         <w:rPr>
-          <w:lang w:eastAsia="zh-CN"/>
-        </w:rPr>
-      </w:pPr>
-      <w:r>
-        <w:rPr>
-          <w:b/>
-          <w:lang w:eastAsia="zh-CN"/>
-        </w:rPr>
-        <w:t>未解决问题：</w:t>
-      </w:r>
-      <w:r>
-        <w:rPr>
-          <w:color w:val="646464"/>
-          <w:lang w:eastAsia="zh-CN"/>
-        </w:rPr>
-        <w:t>[</w:t>
-      </w:r>
-      <w:r>
-        <w:rPr>
-          <w:color w:val="646464"/>
-          <w:lang w:eastAsia="zh-CN"/>
-        </w:rPr>
-        <w:t>填写</w:t>
-      </w:r>
-      <w:r>
-        <w:rPr>
-          <w:color w:val="646464"/>
-          <w:lang w:eastAsia="zh-CN"/>
-        </w:rPr>
-        <w:t>]</w:t>
+          <w:color w:val="646464"/>
+          <w:lang w:eastAsia="zh-CN"/>
+        </w:rPr>
+      </w:pPr>
+      <w:r>
+        <w:rPr>
+          <w:color w:val="646464"/>
+          <w:lang w:eastAsia="zh-CN"/>
+        </w:rPr>
+        <w:t xml:space="preserve">Conda </w:t>
+      </w:r>
+      <w:r>
+        <w:rPr>
+          <w:color w:val="646464"/>
+          <w:lang w:eastAsia="zh-CN"/>
+        </w:rPr>
+        <w:t>版本：</w:t>
+      </w:r>
+      <w:r>
+        <w:rPr>
+          <w:color w:val="646464"/>
+          <w:lang w:eastAsia="zh-CN"/>
+        </w:rPr>
+        <w:t>24.11.3</w:t>
       </w:r>
     </w:p>
     <w:p>
       <w:pPr>
         <w:rPr>
-          <w:lang w:eastAsia="zh-CN"/>
-        </w:rPr>
-      </w:pPr>
-      <w:r>
-        <w:rPr>
-          <w:b/>
-          <w:lang w:eastAsia="zh-CN"/>
-        </w:rPr>
-        <w:t>新会话中</w:t>
-      </w:r>
-      <w:r>
-        <w:rPr>
-          <w:b/>
-          <w:lang w:eastAsia="zh-CN"/>
-        </w:rPr>
-        <w:t xml:space="preserve"> AI </w:t>
-      </w:r>
-      <w:r>
-        <w:rPr>
-          <w:b/>
-          <w:lang w:eastAsia="zh-CN"/>
-        </w:rPr>
-        <w:t>如何复述；我核对或纠正了什么：</w:t>
-      </w:r>
-      <w:r>
-        <w:rPr>
-          <w:color w:val="646464"/>
-          <w:lang w:eastAsia="zh-CN"/>
-        </w:rPr>
-        <w:t>[</w:t>
-      </w:r>
-      <w:r>
-        <w:rPr>
-          <w:color w:val="646464"/>
-          <w:lang w:eastAsia="zh-CN"/>
-        </w:rPr>
-        <w:t>填写</w:t>
-      </w:r>
-      <w:r>
-        <w:rPr>
-          <w:color w:val="646464"/>
-          <w:lang w:eastAsia="zh-CN"/>
-        </w:rPr>
-        <w:t>]</w:t>
+          <w:color w:val="646464"/>
+          <w:lang w:eastAsia="zh-CN"/>
+        </w:rPr>
+      </w:pPr>
+      <w:r>
+        <w:rPr>
+          <w:color w:val="646464"/>
+          <w:lang w:eastAsia="zh-CN"/>
+        </w:rPr>
+        <w:t xml:space="preserve">Anaconda </w:t>
+      </w:r>
+      <w:r>
+        <w:rPr>
+          <w:color w:val="646464"/>
+          <w:lang w:eastAsia="zh-CN"/>
+        </w:rPr>
+        <w:t>安装路径：</w:t>
+      </w:r>
+      <w:r>
+        <w:rPr>
+          <w:color w:val="646464"/>
+          <w:lang w:eastAsia="zh-CN"/>
+        </w:rPr>
+        <w:t>D:\Users\Lenovo\anaconda3</w:t>
       </w:r>
     </w:p>
     <w:p>
       <w:pPr>
         <w:rPr>
-          <w:lang w:eastAsia="zh-CN"/>
-        </w:rPr>
-      </w:pPr>
-      <w:r>
-        <w:rPr>
-          <w:lang w:eastAsia="zh-CN"/>
-        </w:rPr>
-        <w:br w:type="page"/>
+          <w:color w:val="646464"/>
+          <w:lang w:eastAsia="zh-CN"/>
+        </w:rPr>
+      </w:pPr>
+      <w:r>
+        <w:rPr>
+          <w:color w:val="646464"/>
+          <w:lang w:eastAsia="zh-CN"/>
+        </w:rPr>
+        <w:t>项目</w:t>
+      </w:r>
+      <w:r>
+        <w:rPr>
+          <w:color w:val="646464"/>
+          <w:lang w:eastAsia="zh-CN"/>
+        </w:rPr>
+        <w:t xml:space="preserve"> Conda </w:t>
+      </w:r>
+      <w:r>
+        <w:rPr>
+          <w:color w:val="646464"/>
+          <w:lang w:eastAsia="zh-CN"/>
+        </w:rPr>
+        <w:t>环境：</w:t>
+      </w:r>
+      <w:r>
+        <w:rPr>
+          <w:color w:val="646464"/>
+          <w:lang w:eastAsia="zh-CN"/>
+        </w:rPr>
+        <w:t>wafer-scheduling</w:t>
       </w:r>
     </w:p>
     <w:p>
       <w:pPr>
+        <w:rPr>
+          <w:color w:val="646464"/>
+          <w:lang w:eastAsia="zh-CN"/>
+        </w:rPr>
+      </w:pPr>
+      <w:r>
+        <w:rPr>
+          <w:color w:val="646464"/>
+          <w:lang w:eastAsia="zh-CN"/>
+        </w:rPr>
+        <w:t xml:space="preserve">Python </w:t>
+      </w:r>
+      <w:r>
+        <w:rPr>
+          <w:color w:val="646464"/>
+          <w:lang w:eastAsia="zh-CN"/>
+        </w:rPr>
+        <w:t>版本：</w:t>
+      </w:r>
+      <w:r>
+        <w:rPr>
+          <w:color w:val="646464"/>
+          <w:lang w:eastAsia="zh-CN"/>
+        </w:rPr>
+        <w:t>3.11.18</w:t>
+      </w:r>
+    </w:p>
+    <w:p>
+      <w:pPr>
+        <w:rPr>
+          <w:color w:val="646464"/>
+          <w:lang w:eastAsia="zh-CN"/>
+        </w:rPr>
+      </w:pPr>
+      <w:r>
+        <w:rPr>
+          <w:color w:val="646464"/>
+          <w:lang w:eastAsia="zh-CN"/>
+        </w:rPr>
+        <w:t xml:space="preserve">Python </w:t>
+      </w:r>
+      <w:r>
+        <w:rPr>
+          <w:color w:val="646464"/>
+          <w:lang w:eastAsia="zh-CN"/>
+        </w:rPr>
+        <w:t>解释器路径：</w:t>
+      </w:r>
+      <w:r>
+        <w:rPr>
+          <w:color w:val="646464"/>
+          <w:lang w:eastAsia="zh-CN"/>
+        </w:rPr>
+        <w:t>D:\Users\Lenovo\anaconda3\envs\wafer-scheduling\python.exe</w:t>
+      </w:r>
+    </w:p>
+    <w:p>
+      <w:pPr>
+        <w:rPr>
+          <w:color w:val="646464"/>
+          <w:lang w:eastAsia="zh-CN"/>
+        </w:rPr>
+      </w:pPr>
+      <w:r>
+        <w:rPr>
+          <w:color w:val="646464"/>
+          <w:lang w:eastAsia="zh-CN"/>
+        </w:rPr>
+        <w:lastRenderedPageBreak/>
+        <w:t xml:space="preserve">PowerShell </w:t>
+      </w:r>
+      <w:r>
+        <w:rPr>
+          <w:color w:val="646464"/>
+          <w:lang w:eastAsia="zh-CN"/>
+        </w:rPr>
+        <w:t>当前用户执行策略：</w:t>
+      </w:r>
+      <w:r>
+        <w:rPr>
+          <w:color w:val="646464"/>
+          <w:lang w:eastAsia="zh-CN"/>
+        </w:rPr>
+        <w:t>RemoteSigned</w:t>
+      </w:r>
+    </w:p>
+    <w:p>
+      <w:pPr>
+        <w:rPr>
+          <w:color w:val="646464"/>
+          <w:lang w:eastAsia="zh-CN"/>
+        </w:rPr>
+      </w:pPr>
+      <w:r>
+        <w:rPr>
+          <w:color w:val="646464"/>
+          <w:lang w:eastAsia="zh-CN"/>
+        </w:rPr>
+        <w:t xml:space="preserve">GitHub </w:t>
+      </w:r>
+      <w:r>
+        <w:rPr>
+          <w:color w:val="646464"/>
+          <w:lang w:eastAsia="zh-CN"/>
+        </w:rPr>
+        <w:t>用户名：</w:t>
+      </w:r>
+      <w:r>
+        <w:rPr>
+          <w:color w:val="646464"/>
+          <w:lang w:eastAsia="zh-CN"/>
+        </w:rPr>
+        <w:t>ruoxuandai75-art</w:t>
+      </w:r>
+      <w:r>
+        <w:rPr>
+          <w:color w:val="646464"/>
+          <w:lang w:eastAsia="zh-CN"/>
+        </w:rPr>
+        <w:t>]</w:t>
+      </w:r>
+    </w:p>
+    <w:p>
+      <w:pPr>
+        <w:rPr>
+          <w:b/>
+          <w:lang w:eastAsia="zh-CN"/>
+        </w:rPr>
+      </w:pPr>
+      <w:r>
+        <w:rPr>
+          <w:b/>
+          <w:lang w:eastAsia="zh-CN"/>
+        </w:rPr>
+        <w:t>项目真实路径：</w:t>
+      </w:r>
+    </w:p>
+    <w:p>
+      <w:pPr>
+        <w:rPr>
+          <w:color w:val="646464"/>
+          <w:lang w:eastAsia="zh-CN"/>
+        </w:rPr>
+      </w:pPr>
+      <w:r>
+        <w:rPr>
+          <w:color w:val="646464"/>
+          <w:lang w:eastAsia="zh-CN"/>
+        </w:rPr>
+        <w:t>[</w:t>
+      </w:r>
+      <w:r>
+        <w:rPr>
+          <w:color w:val="646464"/>
+          <w:lang w:eastAsia="zh-CN"/>
+        </w:rPr>
+        <w:t>D:\</w:t>
+      </w:r>
+      <w:r>
+        <w:rPr>
+          <w:color w:val="646464"/>
+          <w:lang w:eastAsia="zh-CN"/>
+        </w:rPr>
+        <w:t>研究学习库</w:t>
+      </w:r>
+      <w:r>
+        <w:rPr>
+          <w:color w:val="646464"/>
+          <w:lang w:eastAsia="zh-CN"/>
+        </w:rPr>
+        <w:t>\Projects\wafer-scheduling-homework</w:t>
+      </w:r>
+      <w:r>
+        <w:rPr>
+          <w:color w:val="646464"/>
+          <w:lang w:eastAsia="zh-CN"/>
+        </w:rPr>
+        <w:t>]</w:t>
+      </w:r>
+    </w:p>
+    <w:p>
+      <w:pPr>
+        <w:rPr>
+          <w:b/>
+          <w:lang w:eastAsia="zh-CN"/>
+        </w:rPr>
+      </w:pPr>
+      <w:r>
+        <w:rPr>
+          <w:b/>
+          <w:lang w:eastAsia="zh-CN"/>
+        </w:rPr>
+        <w:t>相关文件：</w:t>
+      </w:r>
+    </w:p>
+    <w:p>
+      <w:pPr>
+        <w:rPr>
+          <w:color w:val="646464"/>
+          <w:lang w:eastAsia="zh-CN"/>
+        </w:rPr>
+      </w:pPr>
+      <w:r>
+        <w:rPr>
+          <w:color w:val="646464"/>
+          <w:lang w:eastAsia="zh-CN"/>
+        </w:rPr>
+        <w:t>[</w:t>
+      </w:r>
+      <w:r>
+        <w:rPr>
+          <w:color w:val="646464"/>
+          <w:lang w:eastAsia="zh-CN"/>
+        </w:rPr>
+        <w:t>项目环境配置：</w:t>
+      </w:r>
+      <w:r>
+        <w:rPr>
+          <w:color w:val="646464"/>
+          <w:lang w:eastAsia="zh-CN"/>
+        </w:rPr>
+        <w:t>environment.yml</w:t>
+      </w:r>
+    </w:p>
+    <w:p>
+      <w:pPr>
+        <w:rPr>
+          <w:color w:val="646464"/>
+          <w:lang w:eastAsia="zh-CN"/>
+        </w:rPr>
+      </w:pPr>
+      <w:r>
+        <w:rPr>
+          <w:color w:val="646464"/>
+          <w:lang w:eastAsia="zh-CN"/>
+        </w:rPr>
+        <w:t>环境检查脚本：</w:t>
+      </w:r>
+      <w:r>
+        <w:rPr>
+          <w:color w:val="646464"/>
+          <w:lang w:eastAsia="zh-CN"/>
+        </w:rPr>
+        <w:t>scripts/check_env.py</w:t>
+      </w:r>
+    </w:p>
+    <w:p>
+      <w:pPr>
+        <w:rPr>
+          <w:color w:val="646464"/>
+          <w:lang w:eastAsia="zh-CN"/>
+        </w:rPr>
+      </w:pPr>
+      <w:r>
+        <w:rPr>
+          <w:color w:val="646464"/>
+          <w:lang w:eastAsia="zh-CN"/>
+        </w:rPr>
+        <w:t>原作业模板：</w:t>
+      </w:r>
+      <w:r>
+        <w:rPr>
+          <w:color w:val="646464"/>
+          <w:lang w:eastAsia="zh-CN"/>
+        </w:rPr>
+        <w:t>docs/notes/W01_</w:t>
+      </w:r>
+      <w:r>
+        <w:rPr>
+          <w:color w:val="646464"/>
+          <w:lang w:eastAsia="zh-CN"/>
+        </w:rPr>
+        <w:t>作业模板</w:t>
+      </w:r>
+      <w:r>
+        <w:rPr>
+          <w:color w:val="646464"/>
+          <w:lang w:eastAsia="zh-CN"/>
+        </w:rPr>
+        <w:t>.docx</w:t>
+      </w:r>
+    </w:p>
+    <w:p>
+      <w:pPr>
+        <w:rPr>
+          <w:color w:val="646464"/>
+          <w:lang w:eastAsia="zh-CN"/>
+        </w:rPr>
+      </w:pPr>
+      <w:r>
+        <w:rPr>
+          <w:color w:val="646464"/>
+          <w:lang w:eastAsia="zh-CN"/>
+        </w:rPr>
+        <w:t>个人作业：</w:t>
+      </w:r>
+      <w:r>
+        <w:rPr>
+          <w:color w:val="646464"/>
+          <w:lang w:eastAsia="zh-CN"/>
+        </w:rPr>
+        <w:t>docs/notes/W01_</w:t>
+      </w:r>
+      <w:r>
+        <w:rPr>
+          <w:color w:val="646464"/>
+          <w:lang w:eastAsia="zh-CN"/>
+        </w:rPr>
+        <w:t>我的作业</w:t>
+      </w:r>
+      <w:r>
+        <w:rPr>
+          <w:color w:val="646464"/>
+          <w:lang w:eastAsia="zh-CN"/>
+        </w:rPr>
+        <w:t>.docx</w:t>
+      </w:r>
+    </w:p>
+    <w:p>
+      <w:pPr>
+        <w:rPr>
+          <w:color w:val="646464"/>
+          <w:lang w:eastAsia="zh-CN"/>
+        </w:rPr>
+      </w:pPr>
+      <w:r>
+        <w:rPr>
+          <w:color w:val="646464"/>
+          <w:lang w:eastAsia="zh-CN"/>
+        </w:rPr>
+        <w:t>参考资料：</w:t>
+      </w:r>
+      <w:r>
+        <w:rPr>
+          <w:color w:val="646464"/>
+          <w:lang w:eastAsia="zh-CN"/>
+        </w:rPr>
+        <w:t>D:\</w:t>
+      </w:r>
+      <w:r>
+        <w:rPr>
+          <w:color w:val="646464"/>
+          <w:lang w:eastAsia="zh-CN"/>
+        </w:rPr>
+        <w:t>研究学习库</w:t>
+      </w:r>
+      <w:r>
+        <w:rPr>
+          <w:color w:val="646464"/>
+          <w:lang w:eastAsia="zh-CN"/>
+        </w:rPr>
+        <w:t>\</w:t>
+      </w:r>
+      <w:r>
+        <w:rPr>
+          <w:color w:val="646464"/>
+          <w:lang w:eastAsia="zh-CN"/>
+        </w:rPr>
+        <w:t>半导体晶圆制造基础知识</w:t>
+      </w:r>
+      <w:r>
+        <w:rPr>
+          <w:color w:val="646464"/>
+          <w:lang w:eastAsia="zh-CN"/>
+        </w:rPr>
+        <w:t>.docx</w:t>
+      </w:r>
+    </w:p>
+    <w:p>
+      <w:pPr>
+        <w:rPr>
+          <w:color w:val="646464"/>
+          <w:lang w:eastAsia="zh-CN"/>
+        </w:rPr>
+      </w:pPr>
+      <w:r>
+        <w:rPr>
+          <w:color w:val="646464"/>
+          <w:lang w:eastAsia="zh-CN"/>
+        </w:rPr>
+        <w:t>个人远程仓库：</w:t>
+      </w:r>
+      <w:r>
+        <w:rPr>
+          <w:color w:val="646464"/>
+          <w:lang w:eastAsia="zh-CN"/>
+        </w:rPr>
+        <w:t>https://github.com/ruoxuandai75-art/wafer-scheduling-homework.git</w:t>
+      </w:r>
+    </w:p>
+    <w:p>
+      <w:pPr>
+        <w:rPr>
+          <w:color w:val="646464"/>
+          <w:lang w:eastAsia="zh-CN"/>
+        </w:rPr>
+      </w:pPr>
+      <w:r>
+        <w:rPr>
+          <w:color w:val="646464"/>
+          <w:lang w:eastAsia="zh-CN"/>
+        </w:rPr>
+        <w:t>远程名称：</w:t>
+      </w:r>
+      <w:r>
+        <w:rPr>
+          <w:color w:val="646464"/>
+          <w:lang w:eastAsia="zh-CN"/>
+        </w:rPr>
+        <w:t>origin</w:t>
+      </w:r>
+    </w:p>
+    <w:p>
+      <w:pPr>
+        <w:rPr>
+          <w:color w:val="646464"/>
+          <w:lang w:eastAsia="zh-CN"/>
+        </w:rPr>
+      </w:pPr>
+      <w:r>
+        <w:rPr>
+          <w:color w:val="646464"/>
+          <w:lang w:eastAsia="zh-CN"/>
+        </w:rPr>
+        <w:t>当前分支：</w:t>
+      </w:r>
+      <w:r>
+        <w:rPr>
+          <w:color w:val="646464"/>
+          <w:lang w:eastAsia="zh-CN"/>
+        </w:rPr>
+        <w:t>main</w:t>
+      </w:r>
+      <w:r>
+        <w:rPr>
+          <w:color w:val="646464"/>
+          <w:lang w:eastAsia="zh-CN"/>
+        </w:rPr>
+        <w:t>]</w:t>
+      </w:r>
+    </w:p>
+    <w:p>
+      <w:pPr>
+        <w:rPr>
+          <w:color w:val="646464"/>
+          <w:lang w:eastAsia="zh-CN"/>
+        </w:rPr>
+      </w:pPr>
+      <w:r>
+        <w:rPr>
+          <w:b/>
+          <w:lang w:eastAsia="zh-CN"/>
+        </w:rPr>
+        <w:t>已验证结果：</w:t>
+      </w:r>
+      <w:r>
+        <w:rPr>
+          <w:color w:val="646464"/>
+          <w:lang w:eastAsia="zh-CN"/>
+        </w:rPr>
+        <w:t>[</w:t>
+      </w:r>
+      <w:r>
+        <w:rPr>
+          <w:color w:val="646464"/>
+          <w:lang w:eastAsia="zh-CN"/>
+        </w:rPr>
+        <w:t>已指导将最新</w:t>
+      </w:r>
+      <w:r>
+        <w:rPr>
+          <w:color w:val="646464"/>
+          <w:lang w:eastAsia="zh-CN"/>
+        </w:rPr>
+        <w:t xml:space="preserve"> Word </w:t>
+      </w:r>
+      <w:r>
+        <w:rPr>
+          <w:color w:val="646464"/>
+          <w:lang w:eastAsia="zh-CN"/>
+        </w:rPr>
+        <w:t>修改暂存、创建新</w:t>
+      </w:r>
+      <w:r>
+        <w:rPr>
+          <w:color w:val="646464"/>
+          <w:lang w:eastAsia="zh-CN"/>
+        </w:rPr>
+        <w:t xml:space="preserve"> commit </w:t>
+      </w:r>
+      <w:r>
+        <w:rPr>
+          <w:color w:val="646464"/>
+          <w:lang w:eastAsia="zh-CN"/>
+        </w:rPr>
+        <w:t>并再次</w:t>
+      </w:r>
+      <w:r>
+        <w:rPr>
+          <w:color w:val="646464"/>
+          <w:lang w:eastAsia="zh-CN"/>
+        </w:rPr>
+        <w:t xml:space="preserve"> push</w:t>
+      </w:r>
+      <w:r>
+        <w:rPr>
+          <w:color w:val="646464"/>
+          <w:lang w:eastAsia="zh-CN"/>
+        </w:rPr>
+        <w:t>]</w:t>
+      </w:r>
+    </w:p>
+    <w:p>
+      <w:pPr>
+        <w:rPr>
+          <w:color w:val="646464"/>
+          <w:lang w:eastAsia="zh-CN"/>
+        </w:rPr>
+      </w:pPr>
+      <w:r>
+        <w:rPr>
+          <w:b/>
+          <w:lang w:eastAsia="zh-CN"/>
+        </w:rPr>
+        <w:t>未解决问题：</w:t>
+      </w:r>
+      <w:r>
+        <w:rPr>
+          <w:color w:val="646464"/>
+          <w:lang w:eastAsia="zh-CN"/>
+        </w:rPr>
+        <w:t>[</w:t>
+      </w:r>
+      <w:r>
+        <w:rPr>
+          <w:color w:val="646464"/>
+          <w:lang w:eastAsia="zh-CN"/>
+        </w:rPr>
+        <w:t>需要确认第二次修改是否已经成功</w:t>
+      </w:r>
+      <w:r>
+        <w:rPr>
+          <w:color w:val="646464"/>
+          <w:lang w:eastAsia="zh-CN"/>
+        </w:rPr>
+        <w:t xml:space="preserve"> commit </w:t>
+      </w:r>
+      <w:r>
+        <w:rPr>
+          <w:color w:val="646464"/>
+          <w:lang w:eastAsia="zh-CN"/>
+        </w:rPr>
+        <w:t>和</w:t>
+      </w:r>
+      <w:r>
+        <w:rPr>
+          <w:color w:val="646464"/>
+          <w:lang w:eastAsia="zh-CN"/>
+        </w:rPr>
+        <w:t xml:space="preserve"> push</w:t>
+      </w:r>
+      <w:r>
+        <w:rPr>
+          <w:color w:val="646464"/>
+          <w:lang w:eastAsia="zh-CN"/>
+        </w:rPr>
+        <w:t>。</w:t>
+      </w:r>
+      <w:r>
+        <w:rPr>
+          <w:color w:val="646464"/>
+          <w:lang w:eastAsia="zh-CN"/>
+        </w:rPr>
+        <w:t>]</w:t>
+      </w:r>
+    </w:p>
+    <w:p>
+      <w:pPr>
+        <w:rPr>
+          <w:b/>
+          <w:lang w:eastAsia="zh-CN"/>
+        </w:rPr>
+      </w:pPr>
+      <w:r>
+        <w:rPr>
+          <w:b/>
+          <w:lang w:eastAsia="zh-CN"/>
+        </w:rPr>
+        <w:t>新会话中</w:t>
+      </w:r>
+      <w:r>
+        <w:rPr>
+          <w:b/>
+          <w:lang w:eastAsia="zh-CN"/>
+        </w:rPr>
+        <w:t xml:space="preserve"> AI </w:t>
+      </w:r>
+      <w:r>
+        <w:rPr>
+          <w:b/>
+          <w:lang w:eastAsia="zh-CN"/>
+        </w:rPr>
+        <w:t>如何复述；我核对或纠正了什么：</w:t>
+      </w:r>
+    </w:p>
+    <w:p>
+      <w:pPr>
+        <w:rPr>
+          <w:color w:val="646464"/>
+          <w:lang w:eastAsia="zh-CN"/>
+        </w:rPr>
+      </w:pPr>
+      <w:r>
+        <w:rPr>
+          <w:color w:val="646464"/>
+          <w:lang w:eastAsia="zh-CN"/>
+        </w:rPr>
+        <w:t>[</w:t>
+      </w:r>
+      <w:r>
+        <w:rPr>
+          <w:color w:val="646464"/>
+          <w:lang w:eastAsia="zh-CN"/>
+        </w:rPr>
+        <w:t>你正在</w:t>
+      </w:r>
+      <w:r>
+        <w:rPr>
+          <w:color w:val="646464"/>
+          <w:lang w:eastAsia="zh-CN"/>
+        </w:rPr>
+        <w:t xml:space="preserve"> Windows 11 </w:t>
+      </w:r>
+      <w:r>
+        <w:rPr>
+          <w:color w:val="646464"/>
+          <w:lang w:eastAsia="zh-CN"/>
+        </w:rPr>
+        <w:t>上完成第一周学习项目。项目已经克隆到正确的本地目录，</w:t>
+      </w:r>
+      <w:r>
+        <w:rPr>
+          <w:color w:val="646464"/>
+          <w:lang w:eastAsia="zh-CN"/>
+        </w:rPr>
+        <w:t>Anaconda</w:t>
+      </w:r>
+      <w:r>
+        <w:rPr>
+          <w:color w:val="646464"/>
+          <w:lang w:eastAsia="zh-CN"/>
+        </w:rPr>
+        <w:t>、</w:t>
+      </w:r>
+      <w:r>
+        <w:rPr>
+          <w:color w:val="646464"/>
+          <w:lang w:eastAsia="zh-CN"/>
+        </w:rPr>
+        <w:t>PowerShell</w:t>
+      </w:r>
+      <w:r>
+        <w:rPr>
+          <w:color w:val="646464"/>
+          <w:lang w:eastAsia="zh-CN"/>
+        </w:rPr>
+        <w:t>、</w:t>
+      </w:r>
+      <w:r>
+        <w:rPr>
+          <w:color w:val="646464"/>
+          <w:lang w:eastAsia="zh-CN"/>
+        </w:rPr>
+        <w:t xml:space="preserve">wafer-scheduling </w:t>
+      </w:r>
+      <w:r>
+        <w:rPr>
+          <w:color w:val="646464"/>
+          <w:lang w:eastAsia="zh-CN"/>
+        </w:rPr>
+        <w:t>环境、</w:t>
+      </w:r>
+      <w:r>
+        <w:rPr>
+          <w:color w:val="646464"/>
+          <w:lang w:eastAsia="zh-CN"/>
+        </w:rPr>
+        <w:t xml:space="preserve">Python 3.11.18 </w:t>
+      </w:r>
+      <w:r>
+        <w:rPr>
+          <w:color w:val="646464"/>
+          <w:lang w:eastAsia="zh-CN"/>
+        </w:rPr>
+        <w:t>和</w:t>
+      </w:r>
+      <w:r>
+        <w:rPr>
+          <w:color w:val="646464"/>
+          <w:lang w:eastAsia="zh-CN"/>
+        </w:rPr>
+        <w:t xml:space="preserve"> VS Code Python </w:t>
+      </w:r>
+      <w:r>
+        <w:rPr>
+          <w:color w:val="646464"/>
+          <w:lang w:eastAsia="zh-CN"/>
+        </w:rPr>
+        <w:t>解释器均已配置并通过检查。你的个人作业文件位于：</w:t>
+      </w:r>
+    </w:p>
+    <w:p>
+      <w:pPr>
+        <w:rPr>
+          <w:color w:val="646464"/>
+          <w:lang w:eastAsia="zh-CN"/>
+        </w:rPr>
+      </w:pPr>
+      <w:r>
+        <w:rPr>
+          <w:color w:val="646464"/>
+          <w:lang w:eastAsia="zh-CN"/>
+        </w:rPr>
+        <w:t>docs/notes/W01_</w:t>
+      </w:r>
+      <w:r>
+        <w:rPr>
+          <w:color w:val="646464"/>
+          <w:lang w:eastAsia="zh-CN"/>
+        </w:rPr>
+        <w:t>我的作业</w:t>
+      </w:r>
+      <w:r>
+        <w:rPr>
+          <w:color w:val="646464"/>
+          <w:lang w:eastAsia="zh-CN"/>
+        </w:rPr>
+        <w:t>.docx</w:t>
+      </w:r>
+    </w:p>
+    <w:p>
+      <w:pPr>
+        <w:rPr>
+          <w:color w:val="646464"/>
+          <w:lang w:eastAsia="zh-CN"/>
+        </w:rPr>
+      </w:pPr>
+      <w:r>
+        <w:rPr>
+          <w:color w:val="646464"/>
+          <w:lang w:eastAsia="zh-CN"/>
+        </w:rPr>
+        <w:t>当前需要确认最新修改已经形成新的本地</w:t>
+      </w:r>
+      <w:r>
+        <w:rPr>
+          <w:color w:val="646464"/>
+          <w:lang w:eastAsia="zh-CN"/>
+        </w:rPr>
+        <w:t xml:space="preserve"> commit</w:t>
+      </w:r>
+      <w:r>
+        <w:rPr>
+          <w:color w:val="646464"/>
+          <w:lang w:eastAsia="zh-CN"/>
+        </w:rPr>
+        <w:t>，并成功推送到个人</w:t>
+      </w:r>
+      <w:r>
+        <w:rPr>
+          <w:color w:val="646464"/>
+          <w:lang w:eastAsia="zh-CN"/>
+        </w:rPr>
+        <w:t xml:space="preserve"> GitHub </w:t>
+      </w:r>
+      <w:r>
+        <w:rPr>
+          <w:color w:val="646464"/>
+          <w:lang w:eastAsia="zh-CN"/>
+        </w:rPr>
+        <w:t>仓库的</w:t>
+      </w:r>
+      <w:r>
+        <w:rPr>
+          <w:color w:val="646464"/>
+          <w:lang w:eastAsia="zh-CN"/>
+        </w:rPr>
+        <w:t xml:space="preserve"> main </w:t>
+      </w:r>
+      <w:r>
+        <w:rPr>
+          <w:color w:val="646464"/>
+          <w:lang w:eastAsia="zh-CN"/>
+        </w:rPr>
+        <w:t>分支，然后通过本地状态和</w:t>
+      </w:r>
+      <w:r>
+        <w:rPr>
+          <w:color w:val="646464"/>
+          <w:lang w:eastAsia="zh-CN"/>
+        </w:rPr>
+        <w:t xml:space="preserve"> GitHub </w:t>
+      </w:r>
+      <w:r>
+        <w:rPr>
+          <w:color w:val="646464"/>
+          <w:lang w:eastAsia="zh-CN"/>
+        </w:rPr>
+        <w:t>网页完成最终核验。</w:t>
+      </w:r>
+      <w:r>
+        <w:rPr>
+          <w:color w:val="646464"/>
+          <w:lang w:eastAsia="zh-CN"/>
+        </w:rPr>
+        <w:t>]</w:t>
+      </w:r>
+    </w:p>
+    <w:p>
+      <w:pPr>
+        <w:rPr>
+          <w:lang w:eastAsia="zh-CN"/>
+        </w:rPr>
+      </w:pPr>
+      <w:r>
+        <w:rPr>
+          <w:lang w:eastAsia="zh-CN"/>
+        </w:rPr>
+        <w:br w:type="page"/>
+      </w:r>
+    </w:p>
+    <w:p>
+      <w:pPr>
         <w:pStyle w:val="1"/>
         <w:rPr>
           <w:lang w:eastAsia="zh-CN"/>
@@ -1468,21 +2291,12 @@
         </w:rPr>
         <w:t xml:space="preserve">39 </w:t>
       </w:r>
-      <w:proofErr w:type="gramStart"/>
-      <w:r>
-        <w:rPr>
-          <w:color w:val="646464"/>
-          <w:lang w:eastAsia="zh-CN"/>
-        </w:rPr>
-        <w:t>个</w:t>
-      </w:r>
-      <w:proofErr w:type="gramEnd"/>
-      <w:r>
-        <w:rPr>
-          <w:color w:val="646464"/>
-          <w:lang w:eastAsia="zh-CN"/>
-        </w:rPr>
-        <w:t>对象全部接收并完成解析，项目内容直接进入当前空目录，没有多套一层同名文件夹。</w:t>
+      <w:r>
+        <w:rPr>
+          <w:color w:val="646464"/>
+          <w:lang w:eastAsia="zh-CN"/>
+        </w:rPr>
+        <w:t>个对象全部接收并完成解析，项目内容直接进入当前空目录，没有多套一层同名文件夹。</w:t>
       </w:r>
       <w:r>
         <w:rPr>
@@ -1703,33 +2517,17 @@
           <w:lang w:eastAsia="zh-CN"/>
         </w:rPr>
       </w:pPr>
-      <w:proofErr w:type="spellStart"/>
       <w:r>
         <w:rPr>
           <w:b/>
         </w:rPr>
-        <w:t>Conda</w:t>
-      </w:r>
-      <w:proofErr w:type="spellEnd"/>
+        <w:t xml:space="preserve">Conda </w:t>
+      </w:r>
       <w:r>
         <w:rPr>
           <w:b/>
         </w:rPr>
-        <w:t xml:space="preserve"> </w:t>
-      </w:r>
-      <w:proofErr w:type="spellStart"/>
-      <w:r>
-        <w:rPr>
-          <w:b/>
-        </w:rPr>
-        <w:t>发行版、版本与安装路径</w:t>
-      </w:r>
-      <w:proofErr w:type="spellEnd"/>
-      <w:r>
-        <w:rPr>
-          <w:b/>
-        </w:rPr>
-        <w:t>：</w:t>
+        <w:t>发行版、版本与安装路径：</w:t>
       </w:r>
     </w:p>
     <w:p>
@@ -1744,7 +2542,6 @@
         </w:rPr>
         <w:t>[</w:t>
       </w:r>
-      <w:proofErr w:type="spellStart"/>
       <w:r>
         <w:rPr>
           <w:color w:val="646464"/>
@@ -1761,14 +2558,7 @@
         <w:rPr>
           <w:color w:val="646464"/>
         </w:rPr>
-        <w:t>Conda</w:t>
-      </w:r>
-      <w:proofErr w:type="spellEnd"/>
-      <w:r>
-        <w:rPr>
-          <w:color w:val="646464"/>
-        </w:rPr>
-        <w:t xml:space="preserve"> 24.11.3</w:t>
+        <w:t>Conda 24.11.3</w:t>
       </w:r>
       <w:r>
         <w:rPr>
@@ -1942,21 +2732,7 @@
         <w:rPr>
           <w:lang w:eastAsia="zh-CN"/>
         </w:rPr>
-        <w:t xml:space="preserve"> </w:t>
-      </w:r>
-      <w:proofErr w:type="spellStart"/>
-      <w:r>
-        <w:rPr>
-          <w:lang w:eastAsia="zh-CN"/>
-        </w:rPr>
-        <w:t>check_env</w:t>
-      </w:r>
-      <w:proofErr w:type="spellEnd"/>
-      <w:r>
-        <w:rPr>
-          <w:lang w:eastAsia="zh-CN"/>
-        </w:rPr>
-        <w:t xml:space="preserve"> </w:t>
+        <w:t xml:space="preserve"> check_env </w:t>
       </w:r>
       <w:r>
         <w:rPr>
@@ -2102,23 +2878,7 @@
           <w:color w:val="646464"/>
           <w:lang w:eastAsia="zh-CN"/>
         </w:rPr>
-        <w:t xml:space="preserve"> </w:t>
-      </w:r>
-      <w:proofErr w:type="spellStart"/>
-      <w:r>
-        <w:rPr>
-          <w:color w:val="646464"/>
-          <w:lang w:eastAsia="zh-CN"/>
-        </w:rPr>
-        <w:t>cwd</w:t>
-      </w:r>
-      <w:proofErr w:type="spellEnd"/>
-      <w:r>
-        <w:rPr>
-          <w:color w:val="646464"/>
-          <w:lang w:eastAsia="zh-CN"/>
-        </w:rPr>
-        <w:t>: D:\</w:t>
+        <w:t xml:space="preserve"> cwd: D:\</w:t>
       </w:r>
       <w:r>
         <w:rPr>
@@ -2251,21 +3011,12 @@
           <w:lang w:eastAsia="zh-CN"/>
         </w:rPr>
       </w:pPr>
-      <w:proofErr w:type="spellStart"/>
-      <w:r>
-        <w:rPr>
-          <w:color w:val="646464"/>
-          <w:lang w:eastAsia="zh-CN"/>
-        </w:rPr>
-        <w:t>Conda</w:t>
-      </w:r>
-      <w:proofErr w:type="spellEnd"/>
-      <w:r>
-        <w:rPr>
-          <w:color w:val="646464"/>
-          <w:lang w:eastAsia="zh-CN"/>
-        </w:rPr>
-        <w:t xml:space="preserve"> </w:t>
+      <w:r>
+        <w:rPr>
+          <w:color w:val="646464"/>
+          <w:lang w:eastAsia="zh-CN"/>
+        </w:rPr>
+        <w:t xml:space="preserve">Conda </w:t>
       </w:r>
       <w:r>
         <w:rPr>
@@ -2289,21 +3040,12 @@
           <w:lang w:eastAsia="zh-CN"/>
         </w:rPr>
       </w:pPr>
-      <w:proofErr w:type="spellStart"/>
-      <w:r>
-        <w:rPr>
-          <w:color w:val="646464"/>
-          <w:lang w:eastAsia="zh-CN"/>
-        </w:rPr>
-        <w:t>Conda</w:t>
-      </w:r>
-      <w:proofErr w:type="spellEnd"/>
-      <w:r>
-        <w:rPr>
-          <w:color w:val="646464"/>
-          <w:lang w:eastAsia="zh-CN"/>
-        </w:rPr>
-        <w:t xml:space="preserve"> prefix </w:t>
+      <w:r>
+        <w:rPr>
+          <w:color w:val="646464"/>
+          <w:lang w:eastAsia="zh-CN"/>
+        </w:rPr>
+        <w:t xml:space="preserve">Conda prefix </w:t>
       </w:r>
       <w:r>
         <w:rPr>
@@ -2369,23 +3111,7 @@
           <w:b/>
           <w:lang w:eastAsia="zh-CN"/>
         </w:rPr>
-        <w:t xml:space="preserve"> </w:t>
-      </w:r>
-      <w:proofErr w:type="spellStart"/>
-      <w:r>
-        <w:rPr>
-          <w:b/>
-          <w:lang w:eastAsia="zh-CN"/>
-        </w:rPr>
-        <w:t>check_env</w:t>
-      </w:r>
-      <w:proofErr w:type="spellEnd"/>
-      <w:r>
-        <w:rPr>
-          <w:b/>
-          <w:lang w:eastAsia="zh-CN"/>
-        </w:rPr>
-        <w:t xml:space="preserve"> </w:t>
+        <w:t xml:space="preserve"> check_env </w:t>
       </w:r>
       <w:r>
         <w:rPr>
@@ -2490,7 +3216,7 @@
           </mc:Choice>
           <mc:Fallback>
             <w:pict>
-              <v:rect w14:anchorId="36B38215" id="矩形 4" o:spid="_x0000_s1026" style="position:absolute;margin-left:1pt;margin-top:54.05pt;width:396pt;height:23.4pt;z-index:251657728;visibility:visible;mso-wrap-style:square;mso-height-percent:0;mso-wrap-distance-left:9pt;mso-wrap-distance-top:0;mso-wrap-distance-right:9pt;mso-wrap-distance-bottom:0;mso-position-horizontal:absolute;mso-position-horizontal-relative:text;mso-position-vertical:absolute;mso-position-vertical-relative:text;mso-height-percent:0;mso-height-relative:margin;v-text-anchor:middle" o:gfxdata="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" filled="f" strokecolor="red">
+              <v:rect w14:anchorId="75BB6F6C" id="矩形 4" o:spid="_x0000_s1026" style="position:absolute;margin-left:1pt;margin-top:54.05pt;width:396pt;height:23.4pt;z-index:251657728;visibility:visible;mso-wrap-style:square;mso-height-percent:0;mso-wrap-distance-left:9pt;mso-wrap-distance-top:0;mso-wrap-distance-right:9pt;mso-wrap-distance-bottom:0;mso-position-horizontal:absolute;mso-position-horizontal-relative:text;mso-position-vertical:absolute;mso-position-vertical-relative:text;mso-height-percent:0;mso-height-relative:margin;v-text-anchor:middle" o:gfxdata="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" filled="f" strokecolor="red">
                 <v:shadow on="t" color="black" opacity="22937f" origin=",.5" offset="0,.63889mm"/>
               </v:rect>
             </w:pict>
@@ -2626,7 +3352,7 @@
           </mc:Choice>
           <mc:Fallback>
             <w:pict>
-              <v:rect w14:anchorId="3816C854" id="矩形 5" o:spid="_x0000_s1026" style="position:absolute;margin-left:8.2pt;margin-top:83.1pt;width:396pt;height:23.4pt;z-index:251658752;visibility:visible;mso-wrap-style:square;mso-height-percent:0;mso-wrap-distance-left:9pt;mso-wrap-distance-top:0;mso-wrap-distance-right:9pt;mso-wrap-distance-bottom:0;mso-position-horizontal:absolute;mso-position-horizontal-relative:text;mso-position-vertical:absolute;mso-position-vertical-relative:text;mso-height-percent:0;mso-height-relative:margin;v-text-anchor:middle" o:gfxdata="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" filled="f" strokecolor="red">
+              <v:rect w14:anchorId="66239FAB" id="矩形 5" o:spid="_x0000_s1026" style="position:absolute;margin-left:8.2pt;margin-top:83.1pt;width:396pt;height:23.4pt;z-index:251658752;visibility:visible;mso-wrap-style:square;mso-height-percent:0;mso-wrap-distance-left:9pt;mso-wrap-distance-top:0;mso-wrap-distance-right:9pt;mso-wrap-distance-bottom:0;mso-position-horizontal:absolute;mso-position-horizontal-relative:text;mso-position-vertical:absolute;mso-position-vertical-relative:text;mso-height-percent:0;mso-height-relative:margin;v-text-anchor:middle" o:gfxdata="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" filled="f" strokecolor="red">
                 <v:shadow on="t" color="black" opacity="22937f" origin=",.5" offset="0,.63889mm"/>
               </v:rect>
             </w:pict>
@@ -3231,7 +3957,7 @@
           </mc:Choice>
           <mc:Fallback>
             <w:pict>
-              <v:rect w14:anchorId="3A80263A" id="矩形 7" o:spid="_x0000_s1026" style="position:absolute;margin-left:22.6pt;margin-top:96.3pt;width:112pt;height:139.6pt;z-index:251662336;visibility:visible;mso-wrap-style:square;mso-wrap-distance-left:9pt;mso-wrap-distance-top:0;mso-wrap-distance-right:9pt;mso-wrap-distance-bottom:0;mso-position-horizontal:absolute;mso-position-horizontal-relative:text;mso-position-vertical:absolute;mso-position-vertical-relative:page;v-text-anchor:middle" o:gfxdata="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" filled="f" strokecolor="#92d050">
+              <v:rect w14:anchorId="012C3145" id="矩形 7" o:spid="_x0000_s1026" style="position:absolute;margin-left:22.6pt;margin-top:96.3pt;width:112pt;height:139.6pt;z-index:251662336;visibility:visible;mso-wrap-style:square;mso-wrap-distance-left:9pt;mso-wrap-distance-top:0;mso-wrap-distance-right:9pt;mso-wrap-distance-bottom:0;mso-position-horizontal:absolute;mso-position-horizontal-relative:text;mso-position-vertical:absolute;mso-position-vertical-relative:page;v-text-anchor:middle" o:gfxdata="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" filled="f" strokecolor="#92d050">
                 <v:shadow on="t" color="black" opacity="22937f" origin=",.5" offset="0,.63889mm"/>
                 <w10:wrap anchory="page"/>
               </v:rect>
@@ -3543,10 +4269,11 @@
       </w:r>
       <w:r>
         <w:rPr>
-          <w:color w:val="646464"/>
-          <w:lang w:eastAsia="zh-CN"/>
-        </w:rPr>
-        <w:t>填写</w:t>
+          <w:rFonts w:hint="eastAsia"/>
+          <w:color w:val="646464"/>
+          <w:lang w:eastAsia="zh-CN"/>
+        </w:rPr>
+        <w:t>操作已会</w:t>
       </w:r>
       <w:r>
         <w:rPr>
@@ -3782,21 +4509,7 @@
         <w:rPr>
           <w:lang w:eastAsia="zh-CN"/>
         </w:rPr>
-        <w:t>的关系图；说明</w:t>
-      </w:r>
-      <w:proofErr w:type="gramStart"/>
-      <w:r>
-        <w:rPr>
-          <w:lang w:eastAsia="zh-CN"/>
-        </w:rPr>
-        <w:t>换载具</w:t>
-      </w:r>
-      <w:proofErr w:type="gramEnd"/>
-      <w:r>
-        <w:rPr>
-          <w:lang w:eastAsia="zh-CN"/>
-        </w:rPr>
-        <w:t>后哪些信息要保持关联。核对晶圆讲义</w:t>
+        <w:t>的关系图；说明换载具后哪些信息要保持关联。核对晶圆讲义</w:t>
       </w:r>
       <w:r>
         <w:rPr>
@@ -3902,21 +4615,12 @@
           <w:lang w:eastAsia="zh-CN"/>
         </w:rPr>
       </w:pPr>
-      <w:proofErr w:type="gramStart"/>
       <w:r>
         <w:rPr>
           <w:b/>
           <w:lang w:eastAsia="zh-CN"/>
         </w:rPr>
-        <w:t>换载具</w:t>
-      </w:r>
-      <w:proofErr w:type="gramEnd"/>
-      <w:r>
-        <w:rPr>
-          <w:b/>
-          <w:lang w:eastAsia="zh-CN"/>
-        </w:rPr>
-        <w:t>后需要保留的关联信息：</w:t>
+        <w:t>换载具后需要保留的关联信息：</w:t>
       </w:r>
     </w:p>
     <w:p>
@@ -4261,23 +4965,7 @@
           <w:color w:val="646464"/>
           <w:lang w:eastAsia="zh-CN"/>
         </w:rPr>
-        <w:t>制造完成后，通常先通过探针台对</w:t>
-      </w:r>
-      <w:proofErr w:type="gramStart"/>
-      <w:r>
-        <w:rPr>
-          <w:color w:val="646464"/>
-          <w:lang w:eastAsia="zh-CN"/>
-        </w:rPr>
-        <w:t>晶</w:t>
-      </w:r>
-      <w:proofErr w:type="gramEnd"/>
-      <w:r>
-        <w:rPr>
-          <w:color w:val="646464"/>
-          <w:lang w:eastAsia="zh-CN"/>
-        </w:rPr>
-        <w:t>圆上的每个</w:t>
+        <w:t>制造完成后，通常先通过探针台对晶圆上的每个</w:t>
       </w:r>
       <w:r>
         <w:rPr>
@@ -4291,23 +4979,7 @@
           <w:color w:val="646464"/>
           <w:lang w:eastAsia="zh-CN"/>
         </w:rPr>
-        <w:t>进行</w:t>
-      </w:r>
-      <w:proofErr w:type="gramStart"/>
-      <w:r>
-        <w:rPr>
-          <w:color w:val="646464"/>
-          <w:lang w:eastAsia="zh-CN"/>
-        </w:rPr>
-        <w:t>晶圆级电</w:t>
-      </w:r>
-      <w:proofErr w:type="gramEnd"/>
-      <w:r>
-        <w:rPr>
-          <w:color w:val="646464"/>
-          <w:lang w:eastAsia="zh-CN"/>
-        </w:rPr>
-        <w:t>性测试，标记合格与不合格</w:t>
+        <w:t>进行晶圆级电性测试，标记合格与不合格</w:t>
       </w:r>
       <w:r>
         <w:rPr>
@@ -4321,23 +4993,7 @@
           <w:color w:val="646464"/>
           <w:lang w:eastAsia="zh-CN"/>
         </w:rPr>
-        <w:t>；</w:t>
-      </w:r>
-      <w:proofErr w:type="gramStart"/>
-      <w:r>
-        <w:rPr>
-          <w:color w:val="646464"/>
-          <w:lang w:eastAsia="zh-CN"/>
-        </w:rPr>
-        <w:t>然后把晶圆</w:t>
-      </w:r>
-      <w:proofErr w:type="gramEnd"/>
-      <w:r>
-        <w:rPr>
-          <w:color w:val="646464"/>
-          <w:lang w:eastAsia="zh-CN"/>
-        </w:rPr>
-        <w:t>切割，挑选合格</w:t>
+        <w:t>；然后把晶圆切割，挑选合格</w:t>
       </w:r>
       <w:r>
         <w:rPr>
@@ -4388,11 +5044,9 @@
         </w:rPr>
         <w:t>说明五种工艺的作用，再用一个材料层的例子解释为什么会重复加工。</w:t>
       </w:r>
-      <w:proofErr w:type="spellStart"/>
       <w:r>
         <w:t>核对晶圆讲义</w:t>
       </w:r>
-      <w:proofErr w:type="spellEnd"/>
       <w:r>
         <w:t xml:space="preserve"> 2.1</w:t>
       </w:r>
@@ -4573,11 +5227,9 @@
             <w:r>
               <w:t>[</w:t>
             </w:r>
-            <w:proofErr w:type="spellStart"/>
             <w:r>
               <w:t>定义加工位置</w:t>
             </w:r>
-            <w:proofErr w:type="spellEnd"/>
             <w:r>
               <w:t>]</w:t>
             </w:r>
@@ -4668,11 +5320,9 @@
             <w:pPr>
               <w:spacing w:after="0"/>
             </w:pPr>
-            <w:proofErr w:type="spellStart"/>
             <w:r>
               <w:t>清洗</w:t>
             </w:r>
-            <w:proofErr w:type="spellEnd"/>
           </w:p>
         </w:tc>
         <w:tc>
@@ -4771,11 +5421,9 @@
             <w:r>
               <w:t>[</w:t>
             </w:r>
-            <w:proofErr w:type="spellStart"/>
             <w:r>
               <w:t>去除多余材料并改善平坦度</w:t>
             </w:r>
-            <w:proofErr w:type="spellEnd"/>
             <w:r>
               <w:t>]</w:t>
             </w:r>
@@ -4795,79 +5443,50 @@
           <w:lang w:eastAsia="zh-CN"/>
         </w:rPr>
       </w:pPr>
-      <w:r>
-        <w:rPr>
-          <w:b/>
-          <w:lang w:eastAsia="zh-CN"/>
-        </w:rPr>
-        <w:t>我向</w:t>
-      </w:r>
-      <w:r>
-        <w:rPr>
-          <w:b/>
-          <w:lang w:eastAsia="zh-CN"/>
-        </w:rPr>
-        <w:t xml:space="preserve"> AI </w:t>
-      </w:r>
-      <w:r>
-        <w:rPr>
-          <w:b/>
-          <w:lang w:eastAsia="zh-CN"/>
-        </w:rPr>
-        <w:t>的追问，以及确认或修正的一点：</w:t>
-      </w:r>
     </w:p>
     <w:p>
       <w:pPr>
         <w:rPr>
-          <w:color w:val="646464"/>
-          <w:lang w:eastAsia="zh-CN"/>
-        </w:rPr>
-      </w:pPr>
-      <w:r>
-        <w:rPr>
-          <w:color w:val="646464"/>
+          <w:b/>
+          <w:lang w:eastAsia="zh-CN"/>
+        </w:rPr>
+      </w:pPr>
+      <w:r>
+        <w:rPr>
+          <w:b/>
           <w:lang w:eastAsia="zh-CN"/>
         </w:rPr>
         <w:lastRenderedPageBreak/>
-        <w:t>[</w:t>
-      </w:r>
-      <w:r>
-        <w:rPr>
-          <w:rFonts w:hint="eastAsia"/>
-          <w:color w:val="646464"/>
-          <w:lang w:eastAsia="zh-CN"/>
-        </w:rPr>
-        <w:t>1.</w:t>
-      </w:r>
-      <w:r>
-        <w:rPr>
-          <w:lang w:eastAsia="zh-CN"/>
-        </w:rPr>
-        <w:t xml:space="preserve"> </w:t>
-      </w:r>
-      <w:r>
-        <w:rPr>
-          <w:color w:val="646464"/>
-          <w:lang w:eastAsia="zh-CN"/>
-        </w:rPr>
-        <w:t>沉积阶段为什么要改变晶圆的材料组成和膜层厚度？</w:t>
+        <w:t>我向</w:t>
+      </w:r>
+      <w:r>
+        <w:rPr>
+          <w:b/>
+          <w:lang w:eastAsia="zh-CN"/>
+        </w:rPr>
+        <w:t xml:space="preserve"> AI </w:t>
+      </w:r>
+      <w:r>
+        <w:rPr>
+          <w:b/>
+          <w:lang w:eastAsia="zh-CN"/>
+        </w:rPr>
+        <w:t>的追问，以及确认或修正的一点：</w:t>
       </w:r>
     </w:p>
     <w:p>
       <w:pPr>
-        <w:ind w:firstLineChars="200" w:firstLine="420"/>
-        <w:rPr>
-          <w:color w:val="646464"/>
-          <w:lang w:eastAsia="zh-CN"/>
-        </w:rPr>
-      </w:pPr>
-      <w:r>
-        <w:rPr>
-          <w:color w:val="646464"/>
-          <w:lang w:eastAsia="zh-CN"/>
-        </w:rPr>
-        <w:t>芯片由许多具有不同功能的材料层组成</w:t>
+        <w:rPr>
+          <w:color w:val="646464"/>
+          <w:lang w:eastAsia="zh-CN"/>
+        </w:rPr>
+      </w:pPr>
+      <w:r>
+        <w:rPr>
+          <w:color w:val="646464"/>
+          <w:lang w:eastAsia="zh-CN"/>
+        </w:rPr>
+        <w:t>[</w:t>
       </w:r>
       <w:r>
         <w:rPr>
@@ -4875,22 +5494,20 @@
           <w:color w:val="646464"/>
           <w:lang w:eastAsia="zh-CN"/>
         </w:rPr>
-        <w:t>，包括：</w:t>
-      </w:r>
-      <w:r>
-        <w:rPr>
-          <w:color w:val="646464"/>
-          <w:lang w:eastAsia="zh-CN"/>
-        </w:rPr>
-        <w:t>导电材料：形成金属互连；绝缘材料：隔开不应导通的</w:t>
-      </w:r>
-      <w:r>
-        <w:rPr>
-          <w:rFonts w:hint="eastAsia"/>
-          <w:color w:val="646464"/>
-          <w:lang w:eastAsia="zh-CN"/>
-        </w:rPr>
-        <w:t>；</w:t>
+        <w:t>1.</w:t>
+      </w:r>
+      <w:r>
+        <w:rPr>
+          <w:lang w:eastAsia="zh-CN"/>
+        </w:rPr>
+        <w:t xml:space="preserve"> </w:t>
+      </w:r>
+      <w:r>
+        <w:rPr>
+          <w:color w:val="646464"/>
+          <w:lang w:eastAsia="zh-CN"/>
+        </w:rPr>
+        <w:t>沉积阶段为什么要改变晶圆的材料组成和膜层厚度？</w:t>
       </w:r>
     </w:p>
     <w:p>
@@ -4906,72 +5523,95 @@
           <w:color w:val="646464"/>
           <w:lang w:eastAsia="zh-CN"/>
         </w:rPr>
-        <w:t>半导体或其他功能材料：构成器件的一部分；保护或阻挡材料：保护已有结构、限制材料扩散。沉积的目的就是把当前需要的材料层加到</w:t>
-      </w:r>
-      <w:proofErr w:type="gramStart"/>
-      <w:r>
-        <w:rPr>
-          <w:color w:val="646464"/>
-          <w:lang w:eastAsia="zh-CN"/>
-        </w:rPr>
-        <w:t>晶</w:t>
-      </w:r>
-      <w:proofErr w:type="gramEnd"/>
-      <w:r>
-        <w:rPr>
-          <w:color w:val="646464"/>
-          <w:lang w:eastAsia="zh-CN"/>
-        </w:rPr>
-        <w:t>圆上</w:t>
+        <w:t>芯片由许多具有不同功能的材料层组成</w:t>
+      </w:r>
+      <w:r>
+        <w:rPr>
+          <w:rFonts w:hint="eastAsia"/>
+          <w:color w:val="646464"/>
+          <w:lang w:eastAsia="zh-CN"/>
+        </w:rPr>
+        <w:t>，包括：</w:t>
+      </w:r>
+      <w:r>
+        <w:rPr>
+          <w:color w:val="646464"/>
+          <w:lang w:eastAsia="zh-CN"/>
+        </w:rPr>
+        <w:t>导电材料：形成金属互连；绝缘材料：隔开不应导通的</w:t>
+      </w:r>
+      <w:r>
+        <w:rPr>
+          <w:rFonts w:hint="eastAsia"/>
+          <w:color w:val="646464"/>
+          <w:lang w:eastAsia="zh-CN"/>
+        </w:rPr>
+        <w:t>；</w:t>
       </w:r>
     </w:p>
     <w:p>
       <w:pPr>
-        <w:rPr>
-          <w:color w:val="646464"/>
-          <w:lang w:eastAsia="zh-CN"/>
-        </w:rPr>
-      </w:pPr>
-      <w:r>
-        <w:rPr>
-          <w:rFonts w:hint="eastAsia"/>
-          <w:color w:val="646464"/>
-          <w:lang w:eastAsia="zh-CN"/>
-        </w:rPr>
-        <w:t>2.</w:t>
-      </w:r>
-      <w:r>
-        <w:rPr>
-          <w:lang w:eastAsia="zh-CN"/>
-        </w:rPr>
-        <w:t xml:space="preserve"> </w:t>
-      </w:r>
-      <w:r>
-        <w:rPr>
-          <w:color w:val="646464"/>
-          <w:lang w:eastAsia="zh-CN"/>
-        </w:rPr>
-        <w:t>光刻，刻蚀阶段为什么需要改变形状？</w:t>
+        <w:ind w:firstLineChars="200" w:firstLine="420"/>
+        <w:rPr>
+          <w:color w:val="646464"/>
+          <w:lang w:eastAsia="zh-CN"/>
+        </w:rPr>
+      </w:pPr>
+      <w:r>
+        <w:rPr>
+          <w:color w:val="646464"/>
+          <w:lang w:eastAsia="zh-CN"/>
+        </w:rPr>
+        <w:t>半导体或其他功能材料：构成器件的一部分；保护或阻挡材料：保护已有结构、限制材料扩散。沉积的目的就是把当前需要的材料层加到晶圆上</w:t>
       </w:r>
     </w:p>
     <w:p>
       <w:pPr>
-        <w:ind w:firstLineChars="200" w:firstLine="420"/>
-        <w:rPr>
-          <w:color w:val="646464"/>
-          <w:lang w:eastAsia="zh-CN"/>
-        </w:rPr>
-      </w:pPr>
-      <w:r>
-        <w:rPr>
-          <w:color w:val="646464"/>
-          <w:lang w:eastAsia="zh-CN"/>
-        </w:rPr>
-        <w:t>集成电路需要把晶体管、接触孔和金属连线放在指定位置</w:t>
+        <w:rPr>
+          <w:color w:val="646464"/>
+          <w:lang w:eastAsia="zh-CN"/>
+        </w:rPr>
+      </w:pPr>
+      <w:r>
+        <w:rPr>
+          <w:rFonts w:hint="eastAsia"/>
+          <w:color w:val="646464"/>
+          <w:lang w:eastAsia="zh-CN"/>
+        </w:rPr>
+        <w:t>2.</w:t>
+      </w:r>
+      <w:r>
+        <w:rPr>
+          <w:lang w:eastAsia="zh-CN"/>
+        </w:rPr>
+        <w:t xml:space="preserve"> </w:t>
+      </w:r>
+      <w:r>
+        <w:rPr>
+          <w:color w:val="646464"/>
+          <w:lang w:eastAsia="zh-CN"/>
+        </w:rPr>
+        <w:t>光刻，刻蚀阶段为什么需要改变形状？</w:t>
       </w:r>
     </w:p>
     <w:p>
       <w:pPr>
+        <w:ind w:firstLineChars="200" w:firstLine="420"/>
+        <w:rPr>
+          <w:color w:val="646464"/>
+          <w:lang w:eastAsia="zh-CN"/>
+        </w:rPr>
+      </w:pPr>
+      <w:r>
+        <w:rPr>
+          <w:color w:val="646464"/>
+          <w:lang w:eastAsia="zh-CN"/>
+        </w:rPr>
+        <w:t>集成电路需要把晶体管、接触孔和金属连线放在指定位置</w:t>
+      </w:r>
+    </w:p>
+    <w:p>
+      <w:pPr>
         <w:rPr>
           <w:color w:val="646464"/>
           <w:lang w:eastAsia="zh-CN"/>
@@ -5006,17 +5646,16 @@
       <w:pPr>
         <w:ind w:firstLineChars="200" w:firstLine="420"/>
         <w:rPr>
+          <w:color w:val="646464"/>
+          <w:lang w:eastAsia="zh-CN"/>
+        </w:rPr>
+      </w:pPr>
+      <w:r>
+        <w:rPr>
           <w:rFonts w:hint="eastAsia"/>
           <w:color w:val="646464"/>
           <w:lang w:eastAsia="zh-CN"/>
         </w:rPr>
-      </w:pPr>
-      <w:r>
-        <w:rPr>
-          <w:rFonts w:hint="eastAsia"/>
-          <w:color w:val="646464"/>
-          <w:lang w:eastAsia="zh-CN"/>
-        </w:rPr>
         <w:t>不是，</w:t>
       </w:r>
       <w:r>
@@ -5152,14 +5791,6 @@
         </w:rPr>
         <w:t>的后续加工图形。</w:t>
       </w:r>
-    </w:p>
-    <w:p>
-      <w:pPr>
-        <w:rPr>
-          <w:color w:val="646464"/>
-          <w:lang w:eastAsia="zh-CN"/>
-        </w:rPr>
-      </w:pPr>
       <w:r>
         <w:rPr>
           <w:color w:val="646464"/>
@@ -5393,14 +6024,12 @@
               <w:spacing w:after="0"/>
               <w:jc w:val="center"/>
             </w:pPr>
-            <w:proofErr w:type="spellStart"/>
             <w:r>
               <w:rPr>
                 <w:b/>
               </w:rPr>
               <w:t>顺序</w:t>
             </w:r>
-            <w:proofErr w:type="spellEnd"/>
           </w:p>
         </w:tc>
         <w:tc>
@@ -6627,21 +7256,12 @@
         </w:rPr>
         <w:t xml:space="preserve"> </w:t>
       </w:r>
-      <w:proofErr w:type="gramStart"/>
-      <w:r>
-        <w:rPr>
-          <w:color w:val="646464"/>
-          <w:lang w:eastAsia="zh-CN"/>
-        </w:rPr>
-        <w:t>最小化总拖期</w:t>
-      </w:r>
-      <w:proofErr w:type="gramEnd"/>
-      <w:r>
-        <w:rPr>
-          <w:color w:val="646464"/>
-          <w:lang w:eastAsia="zh-CN"/>
-        </w:rPr>
-        <w:t>时间</w:t>
+      <w:r>
+        <w:rPr>
+          <w:color w:val="646464"/>
+          <w:lang w:eastAsia="zh-CN"/>
+        </w:rPr>
+        <w:t>最小化总拖期时间</w:t>
       </w:r>
       <w:r>
         <w:rPr>
@@ -6656,23 +7276,7 @@
           <w:color w:val="646464"/>
           <w:lang w:eastAsia="zh-CN"/>
         </w:rPr>
-        <w:t>最小</w:t>
-      </w:r>
-      <w:proofErr w:type="gramStart"/>
-      <w:r>
-        <w:rPr>
-          <w:color w:val="646464"/>
-          <w:lang w:eastAsia="zh-CN"/>
-        </w:rPr>
-        <w:t>化最大</w:t>
-      </w:r>
-      <w:proofErr w:type="gramEnd"/>
-      <w:r>
-        <w:rPr>
-          <w:color w:val="646464"/>
-          <w:lang w:eastAsia="zh-CN"/>
-        </w:rPr>
-        <w:t>延迟</w:t>
+        <w:t>最小化最大延迟</w:t>
       </w:r>
       <w:r>
         <w:rPr>
@@ -7045,15 +7649,7 @@
             <w:color w:val="646464"/>
             <w:lang w:eastAsia="zh-CN"/>
           </w:rPr>
-          <m:t>=</m:t>
-        </m:r>
-        <m:r>
-          <w:rPr>
-            <w:rFonts w:ascii="Cambria Math" w:hAnsi="Cambria Math"/>
-            <w:color w:val="646464"/>
-            <w:lang w:eastAsia="zh-CN"/>
-          </w:rPr>
-          <m:t>1</m:t>
+          <m:t>=1</m:t>
         </m:r>
         <m:r>
           <w:rPr>
@@ -7079,7 +7675,7 @@
     <w:p>
       <w:pPr>
         <w:rPr>
-          <w:rFonts w:ascii="Cambria Math" w:hAnsi="Cambria Math" w:hint="eastAsia"/>
+          <w:rFonts w:ascii="Cambria Math" w:hAnsi="Cambria Math"/>
           <w:i/>
           <w:color w:val="646464"/>
           <w:lang w:eastAsia="zh-CN"/>
@@ -7648,23 +8244,7 @@
           <w:color w:val="646464"/>
           <w:lang w:eastAsia="zh-CN"/>
         </w:rPr>
-        <w:t>两条约束，评价目标也只</w:t>
-      </w:r>
-      <w:proofErr w:type="gramStart"/>
-      <w:r>
-        <w:rPr>
-          <w:color w:val="646464"/>
-          <w:lang w:eastAsia="zh-CN"/>
-        </w:rPr>
-        <w:t>看平均</w:t>
-      </w:r>
-      <w:proofErr w:type="gramEnd"/>
-      <w:r>
-        <w:rPr>
-          <w:color w:val="646464"/>
-          <w:lang w:eastAsia="zh-CN"/>
-        </w:rPr>
-        <w:t>等待；等待没有后续传播对象。放到更复杂的机器、工序场景中，等待就不再是局部量，而会成为影响后续资源竞争和系统状态的变量，主要后果有：</w:t>
+        <w:t>两条约束，评价目标也只看平均等待；等待没有后续传播对象。放到更复杂的机器、工序场景中，等待就不再是局部量，而会成为影响后续资源竞争和系统状态的变量，主要后果有：</w:t>
       </w:r>
     </w:p>
     <w:p>
@@ -7678,7 +8258,6 @@
           <w:lang w:eastAsia="zh-CN"/>
         </w:rPr>
       </w:pPr>
-      <w:proofErr w:type="gramStart"/>
       <w:r>
         <w:rPr>
           <w:b/>
@@ -7686,17 +8265,7 @@
           <w:color w:val="646464"/>
           <w:lang w:eastAsia="zh-CN"/>
         </w:rPr>
-        <w:t>等待沿多工序</w:t>
-      </w:r>
-      <w:proofErr w:type="gramEnd"/>
-      <w:r>
-        <w:rPr>
-          <w:b/>
-          <w:bCs/>
-          <w:color w:val="646464"/>
-          <w:lang w:eastAsia="zh-CN"/>
-        </w:rPr>
-        <w:t>路线传播</w:t>
+        <w:t>等待沿多工序路线传播</w:t>
       </w:r>
       <w:r>
         <w:rPr>
@@ -7878,23 +8447,7 @@
           <w:color w:val="646464"/>
           <w:lang w:eastAsia="zh-CN"/>
         </w:rPr>
-        <w:t>半导体晶</w:t>
-      </w:r>
-      <w:proofErr w:type="gramStart"/>
-      <w:r>
-        <w:rPr>
-          <w:color w:val="646464"/>
-          <w:lang w:eastAsia="zh-CN"/>
-        </w:rPr>
-        <w:t>圆制造</w:t>
-      </w:r>
-      <w:proofErr w:type="gramEnd"/>
-      <w:r>
-        <w:rPr>
-          <w:color w:val="646464"/>
-          <w:lang w:eastAsia="zh-CN"/>
-        </w:rPr>
-        <w:t>中同一设备组会被同一</w:t>
+        <w:t>半导体晶圆制造中同一设备组会被同一</w:t>
       </w:r>
       <w:r>
         <w:rPr>
@@ -7950,7 +8503,6 @@
           <w:lang w:eastAsia="zh-CN"/>
         </w:rPr>
       </w:pPr>
-      <w:proofErr w:type="gramStart"/>
       <w:r>
         <w:rPr>
           <w:b/>
@@ -7958,17 +8510,7 @@
           <w:color w:val="646464"/>
           <w:lang w:eastAsia="zh-CN"/>
         </w:rPr>
-        <w:t>影响组批</w:t>
-      </w:r>
-      <w:proofErr w:type="gramEnd"/>
-      <w:r>
-        <w:rPr>
-          <w:b/>
-          <w:bCs/>
-          <w:color w:val="646464"/>
-          <w:lang w:eastAsia="zh-CN"/>
-        </w:rPr>
-        <w:t>和批处理设备</w:t>
+        <w:t>影响组批和批处理设备</w:t>
       </w:r>
       <w:r>
         <w:rPr>
@@ -8038,23 +8580,7 @@
           <w:color w:val="646464"/>
           <w:lang w:eastAsia="zh-CN"/>
         </w:rPr>
-        <w:t>的等待时间；</w:t>
-      </w:r>
-      <w:proofErr w:type="gramStart"/>
-      <w:r>
-        <w:rPr>
-          <w:color w:val="646464"/>
-          <w:lang w:eastAsia="zh-CN"/>
-        </w:rPr>
-        <w:t>批完成</w:t>
-      </w:r>
-      <w:proofErr w:type="gramEnd"/>
-      <w:r>
-        <w:rPr>
-          <w:color w:val="646464"/>
-          <w:lang w:eastAsia="zh-CN"/>
-        </w:rPr>
-        <w:t>后还可能集中释放到下游，形成新的等待队列。</w:t>
+        <w:t>的等待时间；批完成后还可能集中释放到下游，形成新的等待队列。</w:t>
       </w:r>
     </w:p>
     <w:p>
@@ -8156,23 +8682,7 @@
           <w:color w:val="646464"/>
           <w:lang w:eastAsia="zh-CN"/>
         </w:rPr>
-        <w:t>晶</w:t>
-      </w:r>
-      <w:proofErr w:type="gramStart"/>
-      <w:r>
-        <w:rPr>
-          <w:color w:val="646464"/>
-          <w:lang w:eastAsia="zh-CN"/>
-        </w:rPr>
-        <w:t>圆制造</w:t>
-      </w:r>
-      <w:proofErr w:type="gramEnd"/>
-      <w:r>
-        <w:rPr>
-          <w:color w:val="646464"/>
-          <w:lang w:eastAsia="zh-CN"/>
-        </w:rPr>
-        <w:t>中某些步骤间有</w:t>
+        <w:t>晶圆制造中某些步骤间有</w:t>
       </w:r>
       <w:r>
         <w:rPr>
@@ -8434,23 +8944,7 @@
           <w:color w:val="646464"/>
           <w:lang w:eastAsia="zh-CN"/>
         </w:rPr>
-        <w:t>只在单机、</w:t>
-      </w:r>
-      <w:proofErr w:type="gramStart"/>
-      <w:r>
-        <w:rPr>
-          <w:color w:val="646464"/>
-          <w:lang w:eastAsia="zh-CN"/>
-        </w:rPr>
-        <w:t>独立单</w:t>
-      </w:r>
-      <w:proofErr w:type="gramEnd"/>
-      <w:r>
-        <w:rPr>
-          <w:color w:val="646464"/>
-          <w:lang w:eastAsia="zh-CN"/>
-        </w:rPr>
-        <w:t>工序、同时释放、非抢占等基本条件下有保证。复杂机器环境、释放时刻、批处理、准备时间、重入流下，需要重新判断规则适用性，不能直接把简单例子的结论外推。</w:t>
+        <w:t>只在单机、独立单工序、同时释放、非抢占等基本条件下有保证。复杂机器环境、释放时刻、批处理、准备时间、重入流下，需要重新判断规则适用性，不能直接把简单例子的结论外推。</w:t>
       </w:r>
     </w:p>
     <w:p>
@@ -8680,7 +9174,7 @@
     <w:p>
       <w:pPr>
         <w:rPr>
-          <w:rFonts w:ascii="Cambria Math" w:hAnsi="Cambria Math" w:hint="eastAsia"/>
+          <w:rFonts w:ascii="Cambria Math" w:hAnsi="Cambria Math"/>
           <w:color w:val="646464"/>
           <w:lang w:eastAsia="zh-CN"/>
         </w:rPr>
@@ -8875,7 +9369,7 @@
     <w:p>
       <w:pPr>
         <w:rPr>
-          <w:rFonts w:ascii="Cambria Math" w:hAnsi="Cambria Math" w:hint="eastAsia"/>
+          <w:rFonts w:ascii="Cambria Math" w:hAnsi="Cambria Math"/>
           <w:color w:val="646464"/>
           <w:lang w:eastAsia="zh-CN"/>
         </w:rPr>
@@ -9029,6 +9523,9 @@
         </w:rPr>
       </w:pPr>
       <w:r>
+        <w:rPr>
+          <w:lang w:eastAsia="zh-CN"/>
+        </w:rPr>
         <w:t xml:space="preserve"> </w:t>
       </w:r>
       <w:r>
@@ -9211,18 +9708,25 @@
     <w:p>
       <w:pPr>
         <w:rPr>
+          <w:noProof/>
+          <w:lang w:eastAsia="zh-CN"/>
+        </w:rPr>
+      </w:pPr>
+      <w:r>
+        <w:rPr>
           <w:rFonts w:hint="eastAsia"/>
           <w:noProof/>
           <w:lang w:eastAsia="zh-CN"/>
         </w:rPr>
-      </w:pPr>
+        <w:t>不能</w:t>
+      </w:r>
       <w:r>
         <w:rPr>
           <w:rFonts w:hint="eastAsia"/>
           <w:noProof/>
           <w:lang w:eastAsia="zh-CN"/>
         </w:rPr>
-        <w:t>不能</w:t>
+        <w:t>，该</w:t>
       </w:r>
       <w:r>
         <w:rPr>
@@ -9230,7 +9734,7 @@
           <w:noProof/>
           <w:lang w:eastAsia="zh-CN"/>
         </w:rPr>
-        <w:t>，该</w:t>
+        <w:t>commit</w:t>
       </w:r>
       <w:r>
         <w:rPr>
@@ -9238,7 +9742,7 @@
           <w:noProof/>
           <w:lang w:eastAsia="zh-CN"/>
         </w:rPr>
-        <w:t>commit</w:t>
+        <w:t>目前只存在在本地，并未上传到</w:t>
       </w:r>
       <w:r>
         <w:rPr>
@@ -9246,7 +9750,7 @@
           <w:noProof/>
           <w:lang w:eastAsia="zh-CN"/>
         </w:rPr>
-        <w:t>目前只存在在本地，并未上传到</w:t>
+        <w:t>github</w:t>
       </w:r>
       <w:r>
         <w:rPr>
@@ -9254,45 +9758,36 @@
           <w:noProof/>
           <w:lang w:eastAsia="zh-CN"/>
         </w:rPr>
-        <w:t>github</w:t>
-      </w:r>
+        <w:t>；</w:t>
+      </w:r>
+    </w:p>
+    <w:p>
+      <w:pPr>
+        <w:rPr>
+          <w:noProof/>
+          <w:lang w:eastAsia="zh-CN"/>
+        </w:rPr>
+      </w:pPr>
       <w:r>
         <w:rPr>
           <w:rFonts w:hint="eastAsia"/>
           <w:noProof/>
           <w:lang w:eastAsia="zh-CN"/>
         </w:rPr>
-        <w:t>；</w:t>
+        <w:t>2.</w:t>
+      </w:r>
+      <w:r>
+        <w:rPr>
+          <w:rFonts w:hint="eastAsia"/>
+          <w:noProof/>
+          <w:lang w:eastAsia="zh-CN"/>
+        </w:rPr>
+        <w:t>提交编号表示什么？请让我用自己的话解释。</w:t>
       </w:r>
     </w:p>
     <w:p>
       <w:pPr>
         <w:rPr>
-          <w:noProof/>
-          <w:lang w:eastAsia="zh-CN"/>
-        </w:rPr>
-      </w:pPr>
-      <w:r>
-        <w:rPr>
-          <w:rFonts w:hint="eastAsia"/>
-          <w:noProof/>
-          <w:lang w:eastAsia="zh-CN"/>
-        </w:rPr>
-        <w:t>2.</w:t>
-      </w:r>
-      <w:r>
-        <w:rPr>
-          <w:rFonts w:hint="eastAsia"/>
-          <w:noProof/>
-          <w:lang w:eastAsia="zh-CN"/>
-        </w:rPr>
-        <w:t>提交编号表示什么？请让我用自己的话解释。</w:t>
-      </w:r>
-    </w:p>
-    <w:p>
-      <w:pPr>
-        <w:rPr>
-          <w:rFonts w:hint="eastAsia"/>
           <w:noProof/>
           <w:lang w:eastAsia="zh-CN"/>
         </w:rPr>
@@ -9442,7 +9937,7 @@
     <w:p>
       <w:pPr>
         <w:rPr>
-          <w:rFonts w:ascii="Cambria Math" w:hAnsi="Cambria Math" w:hint="eastAsia"/>
+          <w:rFonts w:ascii="Cambria Math" w:hAnsi="Cambria Math"/>
           <w:color w:val="646464"/>
           <w:lang w:eastAsia="zh-CN"/>
         </w:rPr>
@@ -9611,7 +10106,7 @@
     <w:p>
       <w:pPr>
         <w:rPr>
-          <w:rFonts w:ascii="Cambria Math" w:hAnsi="Cambria Math" w:hint="eastAsia"/>
+          <w:rFonts w:ascii="Cambria Math" w:hAnsi="Cambria Math"/>
           <w:color w:val="646464"/>
           <w:lang w:eastAsia="zh-CN"/>
         </w:rPr>
@@ -9732,7 +10227,7 @@
     <w:p>
       <w:pPr>
         <w:rPr>
-          <w:rFonts w:ascii="Cambria Math" w:hAnsi="Cambria Math" w:hint="eastAsia"/>
+          <w:rFonts w:ascii="Cambria Math" w:hAnsi="Cambria Math"/>
           <w:color w:val="646464"/>
           <w:lang w:eastAsia="zh-CN"/>
         </w:rPr>
@@ -10189,14 +10684,12 @@
           <w:lang w:eastAsia="zh-CN"/>
         </w:rPr>
       </w:pPr>
-      <w:proofErr w:type="spellStart"/>
       <w:r>
         <w:rPr>
           <w:b/>
         </w:rPr>
         <w:t>准备执行的</w:t>
       </w:r>
-      <w:proofErr w:type="spellEnd"/>
       <w:r>
         <w:rPr>
           <w:b/>
@@ -10215,19 +10708,11 @@
         </w:rPr>
         <w:t xml:space="preserve"> push </w:t>
       </w:r>
-      <w:proofErr w:type="spellStart"/>
       <w:r>
         <w:rPr>
           <w:b/>
         </w:rPr>
-        <w:t>命令（不含令牌</w:t>
-      </w:r>
-      <w:proofErr w:type="spellEnd"/>
-      <w:r>
-        <w:rPr>
-          <w:b/>
-        </w:rPr>
-        <w:t>）：</w:t>
+        <w:t>命令（不含令牌）：</w:t>
       </w:r>
     </w:p>
     <w:p>
@@ -10275,7 +10760,6 @@
           <w:lang w:eastAsia="zh-CN"/>
         </w:rPr>
       </w:pPr>
-      <w:proofErr w:type="spellStart"/>
       <w:r>
         <w:rPr>
           <w:b/>
@@ -10286,28 +10770,13 @@
         <w:rPr>
           <w:b/>
         </w:rPr>
-        <w:t>origin</w:t>
-      </w:r>
-      <w:proofErr w:type="spellEnd"/>
+        <w:t xml:space="preserve">origin </w:t>
+      </w:r>
       <w:r>
         <w:rPr>
           <w:b/>
         </w:rPr>
-        <w:t xml:space="preserve"> </w:t>
-      </w:r>
-      <w:proofErr w:type="spellStart"/>
-      <w:r>
-        <w:rPr>
-          <w:b/>
-        </w:rPr>
-        <w:t>指向的个人仓库</w:t>
-      </w:r>
-      <w:proofErr w:type="spellEnd"/>
-      <w:r>
-        <w:rPr>
-          <w:b/>
-        </w:rPr>
-        <w:t>：</w:t>
+        <w:t>指向的个人仓库：</w:t>
       </w:r>
     </w:p>
     <w:p>
@@ -10374,21 +10843,14 @@
       <w:r>
         <w:t xml:space="preserve"> WPS </w:t>
       </w:r>
-      <w:proofErr w:type="spellStart"/>
       <w:r>
         <w:t>打开检查，并结合</w:t>
       </w:r>
-      <w:proofErr w:type="spellEnd"/>
       <w:r>
         <w:t xml:space="preserve"> git status </w:t>
       </w:r>
-      <w:proofErr w:type="spellStart"/>
-      <w:r>
-        <w:t>核对文件名</w:t>
-      </w:r>
-      <w:proofErr w:type="spellEnd"/>
-      <w:r>
-        <w:t>。</w:t>
+      <w:r>
+        <w:t>核对文件名。</w:t>
       </w:r>
       <w:r>
         <w:rPr>
@@ -10425,21 +10887,14 @@
       <w:r>
         <w:t xml:space="preserve"> ] </w:t>
       </w:r>
-      <w:proofErr w:type="spellStart"/>
       <w:r>
         <w:t>账号、模板获取、空目录与</w:t>
       </w:r>
-      <w:proofErr w:type="spellEnd"/>
       <w:r>
         <w:t xml:space="preserve"> origin </w:t>
       </w:r>
-      <w:proofErr w:type="spellStart"/>
-      <w:r>
-        <w:t>已核对</w:t>
-      </w:r>
-      <w:proofErr w:type="spellEnd"/>
-      <w:r>
-        <w:t>。</w:t>
+      <w:r>
+        <w:t>已核对。</w:t>
       </w:r>
     </w:p>
     <w:p>
@@ -10454,11 +10909,7 @@
         <w:t>√</w:t>
       </w:r>
       <w:r>
-        <w:t xml:space="preserve">] VS </w:t>
-      </w:r>
-      <w:proofErr w:type="spellStart"/>
-      <w:r>
-        <w:t>Code</w:t>
+        <w:t>] VS Code</w:t>
       </w:r>
       <w:r>
         <w:t>、</w:t>
@@ -10470,11 +10921,7 @@
         <w:t>、</w:t>
       </w:r>
       <w:r>
-        <w:t>Conda</w:t>
-      </w:r>
-      <w:proofErr w:type="spellEnd"/>
-      <w:r>
-        <w:t xml:space="preserve"> </w:t>
+        <w:t xml:space="preserve">Conda </w:t>
       </w:r>
       <w:r>
         <w:t>与</w:t>
@@ -10482,13 +10929,8 @@
       <w:r>
         <w:t xml:space="preserve"> Python 3.11 </w:t>
       </w:r>
-      <w:proofErr w:type="spellStart"/>
-      <w:r>
-        <w:t>项目解释器可用</w:t>
-      </w:r>
-      <w:proofErr w:type="spellEnd"/>
-      <w:r>
-        <w:t>。</w:t>
+      <w:r>
+        <w:t>项目解释器可用。</w:t>
       </w:r>
     </w:p>
     <w:p>
@@ -10715,11 +11157,9 @@
       <w:pPr>
         <w:pStyle w:val="1"/>
       </w:pPr>
-      <w:proofErr w:type="spellStart"/>
       <w:r>
         <w:t>提交后在提交入口另附</w:t>
       </w:r>
-      <w:proofErr w:type="spellEnd"/>
     </w:p>
     <w:p>
       <w:r>
@@ -10753,22 +11193,18 @@
       <w:r>
         <w:br/>
       </w:r>
-      <w:proofErr w:type="spellStart"/>
       <w:r>
         <w:t>实际分支：</w:t>
       </w:r>
       <w:r>
         <w:t>main</w:t>
       </w:r>
-      <w:proofErr w:type="spellEnd"/>
       <w:r>
         <w:br/>
       </w:r>
-      <w:proofErr w:type="spellStart"/>
       <w:r>
         <w:t>包含答案的完整</w:t>
       </w:r>
-      <w:proofErr w:type="spellEnd"/>
       <w:r>
         <w:t xml:space="preserve"> commit </w:t>
       </w:r>
@@ -10781,16 +11217,11 @@
       <w:r>
         <w:br/>
       </w:r>
-      <w:proofErr w:type="spellStart"/>
       <w:r>
         <w:t>作业相对路径：</w:t>
       </w:r>
       <w:r>
-        <w:t>docs</w:t>
-      </w:r>
-      <w:proofErr w:type="spellEnd"/>
-      <w:r>
-        <w:t>/notes/W01_</w:t>
+        <w:t>docs/notes/W01_</w:t>
       </w:r>
       <w:r>
         <w:t>我的作业</w:t>
@@ -10801,7 +11232,6 @@
       <w:r>
         <w:br/>
       </w:r>
-      <w:proofErr w:type="spellStart"/>
       <w:r>
         <w:t>推送结果与网页核对结果：</w:t>
       </w:r>
@@ -10809,14 +11239,7 @@
         <w:rPr>
           <w:lang w:eastAsia="zh-CN"/>
         </w:rPr>
-        <w:t>git</w:t>
-      </w:r>
-      <w:proofErr w:type="spellEnd"/>
-      <w:r>
-        <w:rPr>
-          <w:lang w:eastAsia="zh-CN"/>
-        </w:rPr>
-        <w:t xml:space="preserve"> push </w:t>
+        <w:t xml:space="preserve">git push </w:t>
       </w:r>
       <w:r>
         <w:rPr>
@@ -10871,7 +11294,6 @@
     <w:p>
       <w:pPr>
         <w:rPr>
-          <w:rFonts w:hint="eastAsia"/>
           <w:lang w:eastAsia="zh-CN"/>
         </w:rPr>
       </w:pPr>
@@ -10947,7 +11369,6 @@
     <w:p>
       <w:pPr>
         <w:rPr>
-          <w:rFonts w:hint="eastAsia"/>
           <w:lang w:eastAsia="zh-CN"/>
         </w:rPr>
       </w:pPr>
@@ -12548,6 +12969,7 @@
   <w:style w:type="character" w:default="1" w:styleId="a2">
     <w:name w:val="Default Paragraph Font"/>
     <w:uiPriority w:val="1"/>
+    <w:semiHidden/>
     <w:unhideWhenUsed/>
   </w:style>
   <w:style w:type="table" w:default="1" w:styleId="a3">
@@ -23358,6 +23780,19 @@
       <w:color w:val="666666"/>
     </w:rPr>
   </w:style>
+  <w:style w:type="paragraph" w:styleId="affa">
+    <w:name w:val="Normal (Web)"/>
+    <w:basedOn w:val="a1"/>
+    <w:uiPriority w:val="99"/>
+    <w:semiHidden/>
+    <w:unhideWhenUsed/>
+    <w:rsid w:val="00592A44"/>
+    <w:rPr>
+      <w:rFonts w:ascii="Times New Roman" w:hAnsi="Times New Roman" w:cs="Times New Roman"/>
+      <w:sz w:val="24"/>
+      <w:szCs w:val="24"/>
+    </w:rPr>
+  </w:style>
 </w:styles>
 </file>
 

</xml_diff>